<commit_message>
Add selections.json and trigger fields for 8 Common Paper templates
selections.json configurations:
- partnership-agreement: 14 groups including cap/exception with cellContext
- professional-services-agreement: 23 groups with standalone certs and
  cap/exception groups
- order-form-with-sla: 7 groups
- ai-addendum, business-associate-agreement, design-partner-agreement,
  order-form, statement-of-work: radio/checkbox selection groups

metadata.yaml trigger field additions:
- partnership-agreement: 12 cap/exception trigger fields (Obligations,
  Payment, Liability sections)
- professional-services-agreement: 40+ trigger fields for deliverables,
  security, publicity, and liability
- order-form-with-sla: 13 trigger fields
- ai-addendum, business-associate, design-partner, order-form,
  statement-of-work: supporting trigger fields

Also fixes term-sheet template.docx (heading numbering cleanup).
</commit_message>
<xml_diff>
--- a/content/templates/common-paper-term-sheet/template.docx
+++ b/content/templates/common-paper-term-sheet/template.docx
@@ -1610,9 +1610,6 @@
     <w:qFormat w:val="1"/>
     <w:rsid w:val="006B4D74"/>
     <w:pPr>
-      <w:numPr>
-        <w:numId w:val="1"/>
-      </w:numPr>
       <w:spacing w:after="240"/>
       <w:jc w:val="both"/>
       <w:outlineLvl w:val="0"/>
@@ -1633,10 +1630,6 @@
     <w:qFormat w:val="1"/>
     <w:rsid w:val="006B4D74"/>
     <w:pPr>
-      <w:numPr>
-        <w:ilvl w:val="1"/>
-        <w:numId w:val="1"/>
-      </w:numPr>
       <w:spacing w:after="240"/>
       <w:jc w:val="both"/>
       <w:outlineLvl w:val="1"/>
@@ -1657,10 +1650,6 @@
     <w:qFormat w:val="1"/>
     <w:rsid w:val="006B4D74"/>
     <w:pPr>
-      <w:numPr>
-        <w:ilvl w:val="2"/>
-        <w:numId w:val="1"/>
-      </w:numPr>
       <w:spacing w:after="240"/>
       <w:jc w:val="both"/>
       <w:outlineLvl w:val="2"/>
@@ -1682,10 +1671,6 @@
     <w:qFormat w:val="1"/>
     <w:rsid w:val="006B4D74"/>
     <w:pPr>
-      <w:numPr>
-        <w:ilvl w:val="3"/>
-        <w:numId w:val="1"/>
-      </w:numPr>
       <w:spacing w:after="240"/>
       <w:jc w:val="both"/>
       <w:outlineLvl w:val="3"/>
@@ -1706,10 +1691,6 @@
     <w:qFormat w:val="1"/>
     <w:rsid w:val="006B4D74"/>
     <w:pPr>
-      <w:numPr>
-        <w:ilvl w:val="4"/>
-        <w:numId w:val="1"/>
-      </w:numPr>
       <w:spacing w:after="240"/>
       <w:jc w:val="both"/>
       <w:outlineLvl w:val="4"/>
@@ -1730,10 +1711,6 @@
     <w:qFormat w:val="1"/>
     <w:rsid w:val="006B4D74"/>
     <w:pPr>
-      <w:numPr>
-        <w:ilvl w:val="5"/>
-        <w:numId w:val="1"/>
-      </w:numPr>
       <w:spacing w:after="240"/>
       <w:jc w:val="both"/>
       <w:outlineLvl w:val="5"/>
@@ -1751,10 +1728,6 @@
     <w:qFormat w:val="1"/>
     <w:rsid w:val="006B4D74"/>
     <w:pPr>
-      <w:numPr>
-        <w:ilvl w:val="6"/>
-        <w:numId w:val="1"/>
-      </w:numPr>
       <w:spacing w:after="240"/>
       <w:jc w:val="both"/>
       <w:outlineLvl w:val="6"/>
@@ -1772,10 +1745,6 @@
     <w:qFormat w:val="1"/>
     <w:rsid w:val="006B4D74"/>
     <w:pPr>
-      <w:numPr>
-        <w:ilvl w:val="7"/>
-        <w:numId w:val="1"/>
-      </w:numPr>
       <w:spacing w:after="240"/>
       <w:jc w:val="both"/>
       <w:outlineLvl w:val="7"/>
@@ -1793,10 +1762,6 @@
     <w:qFormat w:val="1"/>
     <w:rsid w:val="006B4D74"/>
     <w:pPr>
-      <w:numPr>
-        <w:ilvl w:val="8"/>
-        <w:numId w:val="1"/>
-      </w:numPr>
       <w:spacing w:after="240"/>
       <w:jc w:val="both"/>
       <w:outlineLvl w:val="8"/>

</xml_diff>